<commit_message>
Added Lab 04 - jQuery tasks
</commit_message>
<xml_diff>
--- a/Lab_03_HTML_CSS_JS_Sami_Jhammat_232002/documentation of lab 2.docx
+++ b/Lab_03_HTML_CSS_JS_Sami_Jhammat_232002/documentation of lab 2.docx
@@ -34,6 +34,63 @@
           <w:lang w:val="en-US"/>
         </w:rPr>
         <w:t>Roll Number: 232002</w:t>
+      </w:r>
+    </w:p>
+    <w:p>
+      <w:pPr>
+        <w:rPr>
+          <w:rFonts w:hint="default"/>
+          <w:lang w:val="en-US"/>
+        </w:rPr>
+      </w:pPr>
+    </w:p>
+    <w:p>
+      <w:pPr>
+        <w:rPr>
+          <w:rFonts w:hint="default"/>
+          <w:sz w:val="44"/>
+          <w:szCs w:val="44"/>
+          <w:highlight w:val="yellow"/>
+          <w:lang w:val="en-US"/>
+        </w:rPr>
+      </w:pPr>
+      <w:r>
+        <w:rPr>
+          <w:rFonts w:hint="default"/>
+          <w:sz w:val="44"/>
+          <w:szCs w:val="44"/>
+          <w:highlight w:val="yellow"/>
+          <w:lang w:val="en-US"/>
+        </w:rPr>
+        <w:t>Repository link:</w:t>
+      </w:r>
+    </w:p>
+    <w:p>
+      <w:pPr>
+        <w:rPr>
+          <w:rFonts w:hint="default"/>
+          <w:sz w:val="44"/>
+          <w:szCs w:val="44"/>
+          <w:highlight w:val="yellow"/>
+          <w:lang w:val="en-US"/>
+        </w:rPr>
+      </w:pPr>
+      <w:bookmarkStart w:id="0" w:name="_GoBack"/>
+      <w:bookmarkEnd w:id="0"/>
+    </w:p>
+    <w:p>
+      <w:pPr>
+        <w:rPr>
+          <w:rFonts w:hint="default"/>
+          <w:lang w:val="en-US"/>
+        </w:rPr>
+      </w:pPr>
+      <w:r>
+        <w:rPr>
+          <w:rFonts w:hint="default"/>
+          <w:lang w:val="en-US"/>
+        </w:rPr>
+        <w:t>https://github.com/Sami-Jhammat/Full-stack-programming-lab.git</w:t>
       </w:r>
     </w:p>
     <w:p>
@@ -353,8 +410,6 @@
           </wp:inline>
         </w:drawing>
       </w:r>
-      <w:bookmarkStart w:id="0" w:name="_GoBack"/>
-      <w:bookmarkEnd w:id="0"/>
     </w:p>
     <w:p>
       <w:pPr>
@@ -459,7 +514,7 @@
     <w:lsdException w:qFormat="1" w:unhideWhenUsed="0" w:uiPriority="0" w:semiHidden="0" w:name="Title"/>
     <w:lsdException w:unhideWhenUsed="0" w:uiPriority="0" w:semiHidden="0" w:name="Closing"/>
     <w:lsdException w:unhideWhenUsed="0" w:uiPriority="0" w:semiHidden="0" w:name="Signature"/>
-    <w:lsdException w:unhideWhenUsed="0" w:uiPriority="0" w:name="Default Paragraph Font"/>
+    <w:lsdException w:qFormat="1" w:unhideWhenUsed="0" w:uiPriority="0" w:name="Default Paragraph Font"/>
     <w:lsdException w:unhideWhenUsed="0" w:uiPriority="0" w:semiHidden="0" w:name="Body Text"/>
     <w:lsdException w:unhideWhenUsed="0" w:uiPriority="0" w:semiHidden="0" w:name="Body Text Indent"/>
     <w:lsdException w:unhideWhenUsed="0" w:uiPriority="0" w:semiHidden="0" w:name="List Continue"/>
@@ -675,6 +730,7 @@
   <w:style w:type="character" w:default="1" w:styleId="3">
     <w:name w:val="Default Paragraph Font"/>
     <w:semiHidden/>
+    <w:qFormat/>
     <w:uiPriority w:val="0"/>
   </w:style>
   <w:style w:type="table" w:default="1" w:styleId="4">

</xml_diff>